<commit_message>
docs(qms): EM26-28…32 approved (AR-2026-006)
Alexander Peter (review), Sheryl Nazareth (QA) and Anita Johan (Managing Director)
confirmed on 2026-10-14: Development Side Contract Review, Software Requirements
Specification, Requirement Change Record, Design and Development Record,
Identification and Traceability Record. REG-01 and QM-01 updated; audit pack
documents signed.

Co-Authored-By: Claude Opus 5.5 <noreply@anthropic.com>
</commit_message>
<xml_diff>
--- a/docs/EchoMind_Audit_2026-10-14_Project2/01_Contract_Review/EM26-28_Development_Side_Contract_Review.docx
+++ b/docs/EchoMind_Audit_2026-10-14_Project2/01_Contract_Review/EM26-28_Development_Side_Contract_Review.docx
@@ -421,7 +421,7 @@
                 <w:sz w:val="17"/>
                 <w:szCs w:val="17"/>
               </w:rPr>
-              <w:t xml:space="preserve">Issued for approval</w:t>
+              <w:t xml:space="preserve">APPROVED — 2026-10-14 (AR-2026-006)</w:t>
             </w:r>
           </w:p>
         </w:tc>
@@ -781,7 +781,7 @@
                 <w:sz w:val="17"/>
                 <w:szCs w:val="17"/>
               </w:rPr>
-              <w:t xml:space="preserve">Alexander Peter (EchoMind Project Lead) — to confirm</w:t>
+              <w:t xml:space="preserve">Alexander Peter (EchoMind Project Lead) — 2026-10-14</w:t>
             </w:r>
           </w:p>
         </w:tc>
@@ -841,7 +841,7 @@
                 <w:sz w:val="17"/>
                 <w:szCs w:val="17"/>
               </w:rPr>
-              <w:t xml:space="preserve">Sheryl Nazareth (QA / MR) — to confirm</w:t>
+              <w:t xml:space="preserve">Sheryl Nazareth (QA / MR) — 2026-10-14</w:t>
             </w:r>
           </w:p>
         </w:tc>
@@ -901,7 +901,7 @@
                 <w:sz w:val="17"/>
                 <w:szCs w:val="17"/>
               </w:rPr>
-              <w:t xml:space="preserve">Anita Johan (Managing Director) — to confirm</w:t>
+              <w:t xml:space="preserve">Anita Johan (Managing Director) — 2026-10-14</w:t>
             </w:r>
           </w:p>
         </w:tc>

</xml_diff>